<commit_message>
Reporte diario como plantilla copiable + ejemplo de dia lleno (en vez del formato en una linea)
Co-Authored-By: Claude Fable 5 <noreply@anthropic.com>
Claude-Session: https://claude.ai/code/session_018H7C5dx3NvDfXiv3CfhPMa
</commit_message>
<xml_diff>
--- a/recursos/comercial/INDUCCION_COMERCIAL/SPRINT_20_CUPOS.docx
+++ b/recursos/comercial/INDUCCION_COMERCIAL/SPRINT_20_CUPOS.docx
@@ -159,7 +159,187 @@
           <w:b w:val="0"/>
           <w:sz w:val="23"/>
         </w:rPr>
-        <w:t>4. Reporte 6:00 PM: "Hoy contacté a: [nombres] = N · citas agendadas: N · asistidas: N · cierres/abonos: N · caja: $".</w:t>
+        <w:t>4. Reporte de las 6:00 PM por WhatsApp — se copia esta plantilla y se llenan los números:</w:t>
+      </w:r>
+    </w:p>
+    <w:tbl>
+      <w:tblPr>
+        <w:tblStyle w:val="TableGrid"/>
+        <w:tblW w:type="auto" w:w="0"/>
+        <w:tblLook w:firstColumn="1" w:firstRow="1" w:lastColumn="0" w:lastRow="0" w:noHBand="0" w:noVBand="1" w:val="04A0"/>
+      </w:tblPr>
+      <w:tblGrid>
+        <w:gridCol w:w="9972"/>
+      </w:tblGrid>
+      <w:tr>
+        <w:tc>
+          <w:tcPr>
+            <w:tcW w:type="dxa" w:w="9972"/>
+            <w:shd w:val="clear" w:fill="FFF8E7"/>
+          </w:tcPr>
+          <w:p>
+            <w:r>
+              <w:rPr>
+                <w:sz w:val="23"/>
+              </w:rPr>
+              <w:t>REPORTE [día]</w:t>
+            </w:r>
+          </w:p>
+          <w:p>
+            <w:r>
+              <w:rPr>
+                <w:sz w:val="23"/>
+              </w:rPr>
+              <w:t>Contacté hoy a: [los nombres]</w:t>
+            </w:r>
+          </w:p>
+          <w:p>
+            <w:r>
+              <w:rPr>
+                <w:sz w:val="23"/>
+              </w:rPr>
+              <w:t>Total contactados: __</w:t>
+            </w:r>
+          </w:p>
+          <w:p>
+            <w:r>
+              <w:rPr>
+                <w:sz w:val="23"/>
+              </w:rPr>
+              <w:t>Citas agendadas: __</w:t>
+            </w:r>
+          </w:p>
+          <w:p>
+            <w:r>
+              <w:rPr>
+                <w:sz w:val="23"/>
+              </w:rPr>
+              <w:t>Citas asistidas: __</w:t>
+            </w:r>
+          </w:p>
+          <w:p>
+            <w:r>
+              <w:rPr>
+                <w:sz w:val="23"/>
+              </w:rPr>
+              <w:t>Cierres o abonos: __</w:t>
+            </w:r>
+          </w:p>
+          <w:p>
+            <w:r>
+              <w:rPr>
+                <w:sz w:val="23"/>
+              </w:rPr>
+              <w:t>Plata que entró hoy: $ __</w:t>
+            </w:r>
+          </w:p>
+        </w:tc>
+      </w:tr>
+    </w:tbl>
+    <w:p>
+      <w:pPr>
+        <w:spacing w:after="0"/>
+      </w:pPr>
+      <w:r>
+        <w:rPr>
+          <w:sz w:val="8"/>
+        </w:rPr>
+      </w:r>
+    </w:p>
+    <w:p>
+      <w:pPr>
+        <w:spacing w:after="80"/>
+      </w:pPr>
+      <w:r>
+        <w:rPr>
+          <w:b/>
+          <w:sz w:val="23"/>
+        </w:rPr>
+        <w:t>Así se ve lleno un día real:</w:t>
+      </w:r>
+    </w:p>
+    <w:tbl>
+      <w:tblPr>
+        <w:tblStyle w:val="TableGrid"/>
+        <w:tblW w:type="auto" w:w="0"/>
+        <w:tblLook w:firstColumn="1" w:firstRow="1" w:lastColumn="0" w:lastRow="0" w:noHBand="0" w:noVBand="1" w:val="04A0"/>
+      </w:tblPr>
+      <w:tblGrid>
+        <w:gridCol w:w="9972"/>
+      </w:tblGrid>
+      <w:tr>
+        <w:tc>
+          <w:tcPr>
+            <w:tcW w:type="dxa" w:w="9972"/>
+            <w:shd w:val="clear" w:fill="FFF8E7"/>
+          </w:tcPr>
+          <w:p>
+            <w:r>
+              <w:rPr>
+                <w:sz w:val="23"/>
+              </w:rPr>
+              <w:t>REPORTE lunes 14</w:t>
+            </w:r>
+          </w:p>
+          <w:p>
+            <w:r>
+              <w:rPr>
+                <w:sz w:val="23"/>
+              </w:rPr>
+              <w:t>Contacté hoy a: Andrea, Braulio, Carla, Diego, Estefanía… (y sigue la lista)</w:t>
+            </w:r>
+          </w:p>
+          <w:p>
+            <w:r>
+              <w:rPr>
+                <w:sz w:val="23"/>
+              </w:rPr>
+              <w:t>Total contactados: 42</w:t>
+            </w:r>
+          </w:p>
+          <w:p>
+            <w:r>
+              <w:rPr>
+                <w:sz w:val="23"/>
+              </w:rPr>
+              <w:t>Citas agendadas: 5</w:t>
+            </w:r>
+          </w:p>
+          <w:p>
+            <w:r>
+              <w:rPr>
+                <w:sz w:val="23"/>
+              </w:rPr>
+              <w:t>Citas asistidas: 2</w:t>
+            </w:r>
+          </w:p>
+          <w:p>
+            <w:r>
+              <w:rPr>
+                <w:sz w:val="23"/>
+              </w:rPr>
+              <w:t>Cierres o abonos: 1 (abono de $300.000 — cupo separado)</w:t>
+            </w:r>
+          </w:p>
+          <w:p>
+            <w:r>
+              <w:rPr>
+                <w:sz w:val="23"/>
+              </w:rPr>
+              <w:t>Plata que entró hoy: $300.000</w:t>
+            </w:r>
+          </w:p>
+        </w:tc>
+      </w:tr>
+    </w:tbl>
+    <w:p>
+      <w:pPr>
+        <w:spacing w:after="0"/>
+      </w:pPr>
+      <w:r>
+        <w:rPr>
+          <w:sz w:val="8"/>
+        </w:rPr>
       </w:r>
     </w:p>
     <w:p>

</xml_diff>

<commit_message>
Sprint: salto de pagina antes de EL BARRIDO (subtitulo ya no queda suelto al pie de la hoja 1)
Co-Authored-By: Claude Fable 5 <noreply@anthropic.com>
Claude-Session: https://claude.ai/code/session_018H7C5dx3NvDfXiv3CfhPMa
</commit_message>
<xml_diff>
--- a/recursos/comercial/INDUCCION_COMERCIAL/SPRINT_20_CUPOS.docx
+++ b/recursos/comercial/INDUCCION_COMERCIAL/SPRINT_20_CUPOS.docx
@@ -340,6 +340,11 @@
         <w:rPr>
           <w:sz w:val="8"/>
         </w:rPr>
+      </w:r>
+    </w:p>
+    <w:p>
+      <w:r>
+        <w:br w:type="page"/>
       </w:r>
     </w:p>
     <w:p>

</xml_diff>

<commit_message>
Operadores AuPair/W&T = canal de GERENCIA (alianzas B2B, mismo criterio que Juan Diego): la asesora solo recibe las remitidas como leads prioritarios; Mensaje 3 etiquetado "lo envia gerencia"
Co-Authored-By: Claude Fable 5 <noreply@anthropic.com>
Claude-Session: https://claude.ai/code/session_018H7C5dx3NvDfXiv3CfhPMa
</commit_message>
<xml_diff>
--- a/recursos/comercial/INDUCCION_COMERCIAL/SPRINT_20_CUPOS.docx
+++ b/recursos/comercial/INDUCCION_COMERCIAL/SPRINT_20_CUPOS.docx
@@ -562,14 +562,6 @@
               <w:t>OPERADORES Au Pair / W&amp;T</w:t>
             </w:r>
           </w:p>
-          <w:p>
-            <w:r>
-              <w:rPr>
-                <w:sz w:val="20"/>
-              </w:rPr>
-              <w:t>(contactos de gerencia)</w:t>
-            </w:r>
-          </w:p>
         </w:tc>
         <w:tc>
           <w:tcPr>
@@ -580,7 +572,7 @@
               <w:rPr>
                 <w:sz w:val="20"/>
               </w:rPr>
-              <w:t>Mensaje 3 una sola vez + UN seguimiento a las 72h. No es canal semanal: es sembrar y dejar. Si uno responde, la reunión la acompaña gerencia.</w:t>
+              <w:t>Canal de GERENCIA — las alianzas las trabaja gerencia directamente. A ti te llegan las candidatas remitidas como leads normales: las atiendes con prioridad (vienen calientes y con meta clara — el Módulo Pasaporte es su cierre).</w:t>
             </w:r>
           </w:p>
         </w:tc>

</xml_diff>

<commit_message>
Sprint oficial con canal COLEGIOS (asesora captura y agenda en taller de padres, seguimiento 24h; productos por grado) — 7 canales completos
Co-Authored-By: Claude Fable 5 <noreply@anthropic.com>
Claude-Session: https://claude.ai/code/session_018H7C5dx3NvDfXiv3CfhPMa
</commit_message>
<xml_diff>
--- a/recursos/comercial/INDUCCION_COMERCIAL/SPRINT_20_CUPOS.docx
+++ b/recursos/comercial/INDUCCION_COMERCIAL/SPRINT_20_CUPOS.docx
@@ -623,6 +623,42 @@
               <w:rPr>
                 <w:sz w:val="20"/>
               </w:rPr>
+              <w:t>COLEGIOS</w:t>
+            </w:r>
+          </w:p>
+          <w:p>
+            <w:r>
+              <w:rPr>
+                <w:sz w:val="20"/>
+              </w:rPr>
+              <w:t>(School Partner)</w:t>
+            </w:r>
+          </w:p>
+        </w:tc>
+        <w:tc>
+          <w:tcPr>
+            <w:tcW w:type="dxa" w:w="4986"/>
+          </w:tcPr>
+          <w:p>
+            <w:r>
+              <w:rPr>
+                <w:sz w:val="20"/>
+              </w:rPr>
+              <w:t>Las alianzas con colegios las abre GERENCIA. Tu rol: en cada TALLER DE PADRES capturas los datos en sala (nombre del padre, hijo, grado, teléfono) y AGENDAS CITAS ahí mismo a la salida. Después del taller: mensaje de gracias el mismo día + llamada a las 24h a los que no agendaron. Los registrados del taller son leads tuyos — entran a tu reporte como todo lo demás. Productos: 11° = Arranque de enero · 8°-10° = ruta sabatina (nivel individual, sin beca, descuento por forma de pago).</w:t>
+            </w:r>
+          </w:p>
+        </w:tc>
+      </w:tr>
+      <w:tr>
+        <w:tc>
+          <w:tcPr>
+            <w:tcW w:type="dxa" w:w="4986"/>
+          </w:tcPr>
+          <w:p>
+            <w:r>
+              <w:rPr>
+                <w:sz w:val="20"/>
+              </w:rPr>
               <w:t>REDES LOCALES</w:t>
             </w:r>
           </w:p>
@@ -680,7 +716,22 @@
               <w:rPr>
                 <w:sz w:val="20"/>
               </w:rPr>
-              <w:t>Carril EJECUTIVO/B2B: 10 contactos por sesión a perfiles ejecutivos o de RRHH de empresas de Bucaramanga, con el Mensaje 5. LA VENTA ES TUYA de principio a fin (y tu comisión): tú agendas, tú presentas, tú cierras. Gerencia te acompaña en la primera reunión corporativa si la pides, y firma los convenios y precios B2B fuera de tabla. Se reporta como todo lo demás.</w:t>
+              <w:t>Carril EJECUTIVO/B2B: 10 contactos por sesión a perfiles ejecutivos o de RRHH de empresas de Bucaramanga, con el Mensaje 5. LA VENTA ES TUYA de principio a fin (y tu comisión): tú agendas, tú presentas, tú cierras. Gerencia te acompaña en la primera reunión corporativa si la pides, y firma los convenios y precios B2B fuera de tabla.</w:t>
+            </w:r>
+          </w:p>
+          <w:p>
+            <w:r>
+              <w:rPr>
+                <w:sz w:val="20"/>
+              </w:rPr>
+            </w:r>
+          </w:p>
+          <w:p>
+            <w:r>
+              <w:rPr>
+                <w:sz w:val="20"/>
+              </w:rPr>
+              <w:t>TU ESCALERA B2B (nunca abrir regalando): 1) La VENTA — formación pagada para ejecutivos/equipos, con factura. 2) Si no hay presupuesto pero hay interés → la ALIANZA sin costo (Business/Student Partner): ofrécela y entrega el contacto a gerencia — las cartas las envía el rol de alianzas, no tú. 3) No total → base con motivo. Ningún contacto se pierde: venta, alianza o motivo.</w:t>
             </w:r>
           </w:p>
         </w:tc>

</xml_diff>

<commit_message>
Sprint: contactos con NOMBRE Y APELLIDO (regla en entregable 1, plantilla y ejemplo)
Co-Authored-By: Claude Fable 5 <noreply@anthropic.com>
Claude-Session: https://claude.ai/code/session_018H7C5dx3NvDfXiv3CfhPMa
</commit_message>
<xml_diff>
--- a/recursos/comercial/INDUCCION_COMERCIAL/SPRINT_20_CUPOS.docx
+++ b/recursos/comercial/INDUCCION_COMERCIAL/SPRINT_20_CUPOS.docx
@@ -123,7 +123,7 @@
           <w:b/>
           <w:sz w:val="23"/>
         </w:rPr>
-        <w:t>1. 40 CONTACTOS SALIENTES del barrido, con comentario en el bot por cada uno: resultado + próximo paso.</w:t>
+        <w:t>1. 40 CONTACTOS SALIENTES del barrido, con comentario en el bot por cada uno: resultado + próximo paso. Todo contacto se registra con NOMBRE Y APELLIDO — hay muchos Andreas y Juanes.</w:t>
       </w:r>
     </w:p>
     <w:p>
@@ -190,7 +190,7 @@
               <w:rPr>
                 <w:sz w:val="23"/>
               </w:rPr>
-              <w:t>Contacté hoy a: [los nombres]</w:t>
+              <w:t>Contacté hoy a: [nombres Y APELLIDOS]</w:t>
             </w:r>
           </w:p>
           <w:p>
@@ -286,7 +286,7 @@
               <w:rPr>
                 <w:sz w:val="23"/>
               </w:rPr>
-              <w:t>Contacté hoy a: Andrea, Braulio, Carla, Diego, Estefanía… (y sigue la lista)</w:t>
+              <w:t>Contacté hoy a: Andrea Gómez, Braulio Pérez, Carla Ruiz, Diego Mantilla, Estefanía León… (y sigue la lista)</w:t>
             </w:r>
           </w:p>
           <w:p>

</xml_diff>

<commit_message>
Sprint oficial final: conectado a la planilla (regla de registro bot/planilla + vencimientos en hoja 1 con estados)
Co-Authored-By: Claude Fable 5 <noreply@anthropic.com>
Claude-Session: https://claude.ai/code/session_018H7C5dx3NvDfXiv3CfhPMa
</commit_message>
<xml_diff>
--- a/recursos/comercial/INDUCCION_COMERCIAL/SPRINT_20_CUPOS.docx
+++ b/recursos/comercial/INDUCCION_COMERCIAL/SPRINT_20_CUPOS.docx
@@ -124,6 +124,18 @@
           <w:sz w:val="23"/>
         </w:rPr>
         <w:t>1. 40 CONTACTOS SALIENTES del barrido, con comentario en el bot por cada uno: resultado + próximo paso. Todo contacto se registra con NOMBRE Y APELLIDO — hay muchos Andreas y Juanes.</w:t>
+      </w:r>
+    </w:p>
+    <w:p>
+      <w:pPr>
+        <w:spacing w:after="80"/>
+      </w:pPr>
+      <w:r>
+        <w:rPr>
+          <w:b w:val="0"/>
+          <w:sz w:val="23"/>
+        </w:rPr>
+        <w:t>REGLA DE REGISTRO: lo que nace en el bot se comenta EN el bot; todo lo demás (colegios, empresas, grupos, LinkedIn, referidos) vive en la PLANILLA_SPRINT (hoja FUERA DEL BOT). El reporte de las 6 PM sale de las dos fuentes.</w:t>
       </w:r>
     </w:p>
     <w:p>
@@ -769,7 +781,7 @@
           <w:b w:val="0"/>
           <w:sz w:val="23"/>
         </w:rPr>
-        <w:t>Toda oferta que no cierra sale POR ESCRITO con vencimiento de 72 horas — desde el miércoles habrá ofertas TUYAS venciendo cada día. Rutina diaria: revisar cuáles vencen HOY y llamarlas: "tu beca vence hoy a las 6 PM". La lista de vencimientos la construyes tú misma con cada oferta que emitas.</w:t>
+        <w:t>Toda oferta que no cierra sale POR ESCRITO con vencimiento de 72 horas y se registra EL MISMO DÍA en la PLANILLA_SPRINT (hoja OFERTAS Y VENCIMIENTOS). Rutina diaria: filtrar la columna VENCE por HOY y llamarlas: "tu beca vence hoy a las 6 PM". Estado de cada una: VIGENTE, CERRÓ, VENCIÓ o RE-PRESENTADA — la fecha SE CUMPLE.</w:t>
       </w:r>
     </w:p>
     <w:p>

</xml_diff>

<commit_message>
Sprint: reporte 6PM = pantallazo (nombres) + numeros escritos (sin doble digitacion) + salto forzado eliminado (pagina 2 en blanco arreglada, 3 pags fluidas)
Co-Authored-By: Claude Fable 5 <noreply@anthropic.com>
Claude-Session: https://claude.ai/code/session_018H7C5dx3NvDfXiv3CfhPMa
</commit_message>
<xml_diff>
--- a/recursos/comercial/INDUCCION_COMERCIAL/SPRINT_20_CUPOS.docx
+++ b/recursos/comercial/INDUCCION_COMERCIAL/SPRINT_20_CUPOS.docx
@@ -171,7 +171,7 @@
           <w:b w:val="0"/>
           <w:sz w:val="23"/>
         </w:rPr>
-        <w:t>4. Reporte de las 6:00 PM por WhatsApp — se copia esta plantilla y se llenan los números:</w:t>
+        <w:t>4. Reporte de las 6:00 PM por WhatsApp: PANTALLAZO del día (planilla o bot — los nombres van ahí, sin re-escribirlos) + estos números escritos:</w:t>
       </w:r>
     </w:p>
     <w:tbl>
@@ -352,11 +352,6 @@
         <w:rPr>
           <w:sz w:val="8"/>
         </w:rPr>
-      </w:r>
-    </w:p>
-    <w:p>
-      <w:r>
-        <w:br w:type="page"/>
       </w:r>
     </w:p>
     <w:p>

</xml_diff>

<commit_message>
Reporte 6PM clarificado: DOS cosas en UN mensaje — PRIMERO foto de la planilla (nombres), SEGUNDO los 5 numeros escritos; plantilla y ejemplo alineados (arregla contradiccion de un replace fallido)
Co-Authored-By: Claude Fable 5 <noreply@anthropic.com>
Claude-Session: https://claude.ai/code/session_018H7C5dx3NvDfXiv3CfhPMa
</commit_message>
<xml_diff>
--- a/recursos/comercial/INDUCCION_COMERCIAL/SPRINT_20_CUPOS.docx
+++ b/recursos/comercial/INDUCCION_COMERCIAL/SPRINT_20_CUPOS.docx
@@ -168,10 +168,34 @@
       </w:pPr>
       <w:r>
         <w:rPr>
+          <w:b/>
+          <w:sz w:val="23"/>
+        </w:rPr>
+        <w:t>4. Reporte de las 6:00 PM por WhatsApp — son DOS cosas en UN solo mensaje:</w:t>
+      </w:r>
+    </w:p>
+    <w:p>
+      <w:pPr>
+        <w:spacing w:after="80"/>
+      </w:pPr>
+      <w:r>
+        <w:rPr>
           <w:b w:val="0"/>
           <w:sz w:val="23"/>
         </w:rPr>
-        <w:t>4. Reporte de las 6:00 PM por WhatsApp: PANTALLAZO del día (planilla o bot — los nombres van ahí, sin re-escribirlos) + estos números escritos:</w:t>
+        <w:t xml:space="preserve">   PRIMERO — una FOTO: pantallazo de la planilla con las filas de hoy (ahí se ven los nombres y apellidos de los contactados — no hay que volverlos a escribir).</w:t>
+      </w:r>
+    </w:p>
+    <w:p>
+      <w:pPr>
+        <w:spacing w:after="80"/>
+      </w:pPr>
+      <w:r>
+        <w:rPr>
+          <w:b w:val="0"/>
+          <w:sz w:val="23"/>
+        </w:rPr>
+        <w:t xml:space="preserve">   SEGUNDO — escrito debajo, este resumen de números:</w:t>
       </w:r>
     </w:p>
     <w:tbl>
@@ -195,14 +219,6 @@
                 <w:sz w:val="23"/>
               </w:rPr>
               <w:t>REPORTE [día]</w:t>
-            </w:r>
-          </w:p>
-          <w:p>
-            <w:r>
-              <w:rPr>
-                <w:sz w:val="23"/>
-              </w:rPr>
-              <w:t>Contacté hoy a: [nombres Y APELLIDOS]</w:t>
             </w:r>
           </w:p>
           <w:p>
@@ -267,7 +283,7 @@
           <w:b/>
           <w:sz w:val="23"/>
         </w:rPr>
-        <w:t>Así se ve lleno un día real:</w:t>
+        <w:t>Así se ve un día real:</w:t>
       </w:r>
     </w:p>
     <w:tbl>
@@ -290,7 +306,7 @@
               <w:rPr>
                 <w:sz w:val="23"/>
               </w:rPr>
-              <w:t>REPORTE lunes 14</w:t>
+              <w:t>[FOTO: pantallazo de la planilla del día — se ven Andrea Gómez, Braulio Pérez, Carla Ruiz…]</w:t>
             </w:r>
           </w:p>
           <w:p>
@@ -298,7 +314,14 @@
               <w:rPr>
                 <w:sz w:val="23"/>
               </w:rPr>
-              <w:t>Contacté hoy a: Andrea Gómez, Braulio Pérez, Carla Ruiz, Diego Mantilla, Estefanía León… (y sigue la lista)</w:t>
+            </w:r>
+          </w:p>
+          <w:p>
+            <w:r>
+              <w:rPr>
+                <w:sz w:val="23"/>
+              </w:rPr>
+              <w:t>REPORTE lunes 14</w:t>
             </w:r>
           </w:p>
           <w:p>

</xml_diff>

<commit_message>
Sprint: 4a rama del barrido — contesta BRAVO -> Mensaje 6, un mensaje y silencio, escalar mismo dia, NO CONTACTAR
Co-Authored-By: Claude Fable 5 <noreply@anthropic.com>
Claude-Session: https://claude.ai/code/session_018H7C5dx3NvDfXiv3CfhPMa
</commit_message>
<xml_diff>
--- a/recursos/comercial/INDUCCION_COMERCIAL/SPRINT_20_CUPOS.docx
+++ b/recursos/comercial/INDUCCION_COMERCIAL/SPRINT_20_CUPOS.docx
@@ -436,6 +436,18 @@
           <w:sz w:val="23"/>
         </w:rPr>
         <w:t>· No contesta → llamada a las +24h → último mensaje a las +48h → comentario y se sigue.</w:t>
+      </w:r>
+    </w:p>
+    <w:p>
+      <w:pPr>
+        <w:spacing w:after="80"/>
+      </w:pPr>
+      <w:r>
+        <w:rPr>
+          <w:b/>
+          <w:sz w:val="23"/>
+        </w:rPr>
+        <w:t>· Contesta BRAVO (reclamo, "mala experiencia") → Mensaje 6, UN solo mensaje y silencio · pantallazo a gerencia el MISMO día · estado NO CONTACTAR (reclamo) en la planilla — no vuelve a ninguna tanda. Jamás discutir, jamás ofrecer plata.</w:t>
       </w:r>
     </w:p>
     <w:p>

</xml_diff>

<commit_message>
No hay lider de alianzas: la ASESORA busca, presenta y gestiona empresas y colegios (cartas firmadas por gerencia, solo la firma del convenio es de gerencia); escalera B2B y candado de condiciones actualizados
Co-Authored-By: Claude Fable 5 <noreply@anthropic.com>
Claude-Session: https://claude.ai/code/session_018H7C5dx3NvDfXiv3CfhPMa
</commit_message>
<xml_diff>
--- a/recursos/comercial/INDUCCION_COMERCIAL/SPRINT_20_CUPOS.docx
+++ b/recursos/comercial/INDUCCION_COMERCIAL/SPRINT_20_CUPOS.docx
@@ -650,7 +650,7 @@
               <w:rPr>
                 <w:sz w:val="20"/>
               </w:rPr>
-              <w:t>Canal de GERENCIA y el líder de alianzas (Business/Student Partner). A ti te llegan los empleados BECADOS de empresas aliadas como leads calientes — regla del mejor beneficio: si el becado califica a una beca superior del Fondo, se le aplica la mejor, nunca ambas.</w:t>
+              <w:t>TUYO de principio a fin: tú buscas las empresas, presentas Business y Student Partner (con las cartas firmadas por gerencia — las llevas tú) y gestionas la relación. Solo la FIRMA del convenio es de gerencia: tú no firmas ni pactas condiciones fuera de las escritas. Los empleados becados que lleguen los atiendes tú — regla del mejor beneficio: si el becado califica a una beca superior del Fondo, se aplica la mejor, nunca ambas.</w:t>
             </w:r>
           </w:p>
         </w:tc>
@@ -686,7 +686,7 @@
               <w:rPr>
                 <w:sz w:val="20"/>
               </w:rPr>
-              <w:t>Las alianzas con colegios las abre GERENCIA. Tu rol: en cada TALLER DE PADRES capturas los datos en sala (nombre del padre, hijo, grado, teléfono) y AGENDAS CITAS ahí mismo a la salida. Después del taller: mensaje de gracias el mismo día + llamada a las 24h a los que no agendaron. Los registrados del taller son leads tuyos — entran a tu reporte como todo lo demás. Productos: 11° = Arranque de enero · 8°-10° = ruta sabatina (nivel individual, sin beca, descuento por forma de pago).</w:t>
+              <w:t>TUYO también: tú buscas y agendas los colegios (con la carta School Partner firmada por gerencia). El taller lo dicta gerencia; tu rol en cada TALLER DE PADRES capturas los datos en sala (nombre del padre, hijo, grado, teléfono) y AGENDAS CITAS ahí mismo a la salida. Después del taller: mensaje de gracias el mismo día + llamada a las 24h a los que no agendaron. Los registrados del taller son leads tuyos — entran a tu reporte como todo lo demás. Productos: 11° = Arranque de enero · 8°-10° = ruta sabatina (nivel individual, sin beca, descuento por forma de pago).</w:t>
             </w:r>
           </w:p>
         </w:tc>
@@ -773,7 +773,7 @@
               <w:rPr>
                 <w:sz w:val="20"/>
               </w:rPr>
-              <w:t>TU ESCALERA B2B (nunca abrir regalando): 1) La VENTA — formación pagada para ejecutivos/equipos, con factura. 2) Si no hay presupuesto pero hay interés → la ALIANZA sin costo (Business/Student Partner): ofrécela y entrega el contacto a gerencia — las cartas las envía el rol de alianzas, no tú. 3) No total → base con motivo. Ningún contacto se pierde: venta, alianza o motivo.</w:t>
+              <w:t>TU ESCALERA B2B (nunca abrir regalando): 1) La VENTA — formación pagada para ejecutivos/equipos, con factura. 2) Si no hay presupuesto pero hay interés → la ALIANZA sin costo (Business/Student Partner): la ofreces y la GESTIONAS TÚ, con las cartas firmadas por gerencia — solo la firma del convenio es de gerencia. 3) No total → base con motivo. Ningún contacto se pierde: venta, alianza o motivo.</w:t>
             </w:r>
           </w:p>
         </w:tc>

</xml_diff>

<commit_message>
Sprint oficial definitivo: taller por designado de gerencia, sin parentesis de comision, celda empresas apunta a Duda 2
Co-Authored-By: Claude Fable 5 <noreply@anthropic.com>
Claude-Session: https://claude.ai/code/session_018H7C5dx3NvDfXiv3CfhPMa
</commit_message>
<xml_diff>
--- a/recursos/comercial/INDUCCION_COMERCIAL/SPRINT_20_CUPOS.docx
+++ b/recursos/comercial/INDUCCION_COMERCIAL/SPRINT_20_CUPOS.docx
@@ -686,7 +686,7 @@
               <w:rPr>
                 <w:sz w:val="20"/>
               </w:rPr>
-              <w:t>TUYO también: tú buscas y agendas los colegios (con la carta School Partner firmada por gerencia). El taller lo dicta gerencia; tu rol en cada TALLER DE PADRES capturas los datos en sala (nombre del padre, hijo, grado, teléfono) y AGENDAS CITAS ahí mismo a la salida. Después del taller: mensaje de gracias el mismo día + llamada a las 24h a los que no agendaron. Los registrados del taller son leads tuyos — entran a tu reporte como todo lo demás. Productos: 11° = Arranque de enero · 8°-10° = ruta sabatina (nivel individual, sin beca, descuento por forma de pago).</w:t>
+              <w:t>TUYO también: tú buscas y agendas los colegios (con la carta School Partner firmada por gerencia). El taller lo dicta quien designe gerencia; tu rol en cada TALLER DE PADRES capturas los datos en sala (nombre del padre, hijo, grado, teléfono) y AGENDAS CITAS ahí mismo a la salida. Después del taller: mensaje de gracias el mismo día + llamada a las 24h a los que no agendaron. Los registrados del taller son leads tuyos — entran a tu reporte como todo lo demás. Productos: 11° = Arranque de enero · 8°-10° = ruta sabatina (nivel individual, sin beca, descuento por forma de pago).</w:t>
             </w:r>
           </w:p>
         </w:tc>
@@ -758,7 +758,7 @@
               <w:rPr>
                 <w:sz w:val="20"/>
               </w:rPr>
-              <w:t>Carril EJECUTIVO/B2B: 10 contactos por sesión a perfiles ejecutivos o de RRHH de empresas de Bucaramanga, con el Mensaje 5. LA VENTA ES TUYA de principio a fin (y tu comisión): tú agendas, tú presentas, tú cierras. Gerencia te acompaña en la primera reunión corporativa si la pides, y firma los convenios y precios B2B fuera de tabla.</w:t>
+              <w:t>Carril EJECUTIVO/B2B: 10 contactos por sesión a perfiles ejecutivos o de RRHH de empresas de Bucaramanga, con el Mensaje 5. LA VENTA ES TUYA de principio a fin: tú agendas, tú presentas, tú cierras. Gerencia te acompaña en la primera reunión corporativa si la pides, y firma los convenios y precios B2B fuera de tabla.</w:t>
             </w:r>
           </w:p>
           <w:p>

</xml_diff>